<commit_message>
Docs: record the open risk that the missing forget-gate init poses to the alpha conclusion
Every result so far was produced without initial_forget_bias, and the defect it acts on is
exactly the one diagnosed: under-dispersion. So what this report calls a ceiling may be a
missing component rather than an intrinsic limit. Until the separating runs return, the
alpha discussion should read as "alpha is the dominant defect of the models trained here",
not as a statement about the architecture.

Comparisons are unaffected -- every run used the same initialisation.

Co-Authored-By: Claude Opus 5 <noreply@anthropic.com>
</commit_message>
<xml_diff>
--- a/reports/PhaseI_report.docx
+++ b/reports/PhaseI_report.docx
@@ -6698,6 +6698,37 @@
     </w:p>
     <w:p>
       <w:pPr>
+        <w:pStyle w:val="Heading2"/>
+      </w:pPr>
+      <w:r>
+        <w:t>4.5 一个尚未解决的保留：遗忘门初始化</w:t>
+      </w:r>
+    </w:p>
+    <w:p>
+      <w:r>
+        <w:t>Gauch 等人的 MTS-LSTM 原始实现在初始化时打开 LSTM 遗忘门（neuralhydrology 中 initial_forget_bias = 3）。本实现与其所依据的 100 站参考实现均未包含这一项——偏离的是原论文，而非两个实验之间。本报告全部结果都是在缺少该项的情况下产生的。</w:t>
+      </w:r>
+    </w:p>
+    <w:p>
+      <w:r>
+        <w:t>这对欠离散这一结论尤其关键：遗忘门半闭时，365 步的日分支会让细胞状态在到达状态交接点之前衰减，积雪与地下水这类长记忆信号因而到不了小时分支。其预期症状恰好就是退化解诊断测到的现象——M0 的日间变化远远不足，而日内抖动过量 3.1 倍。</w:t>
+      </w:r>
+    </w:p>
+    <w:p>
+      <w:r>
+        <w:rPr>
+          <w:b/>
+        </w:rPr>
+        <w:t>因此本报告称为“天花板”的部分，可能是一个缺失组件而非固有限制。fold 1 搜索中的 g03_forgetbias_H72 与 g04_forgetbias_H168 固定小时窗口、只改遗忘门，正是为分离二者而设。在其返回之前，§4 与 §5 关于 α 的论述应读作“α 是本文所训练模型的主导缺陷”，而非关于该架构本身的论断。</w:t>
+      </w:r>
+    </w:p>
+    <w:p>
+      <w:r>
+        <w:t>对比类结论不受影响：基线、run A、run B、空间分块、各档回放与非洲全部使用同一套初始化，故 ΔKGE、随机与分块之差、回放比例扫描、非洲增益均成立。可能变动的是绝对水平，以及把 α 解释为根本限制这一点。</w:t>
+      </w:r>
+    </w:p>
+    <w:p>
+      <w:pPr>
         <w:pStyle w:val="Heading1"/>
       </w:pPr>
       <w:r>
@@ -6741,7 +6772,7 @@
         <w:pStyle w:val="ListNumber"/>
       </w:pPr>
       <w:r>
-        <w:t>五、真正的性能瓶颈是欠离散，且在迁移之前就已存在。M0 时 76.6% 的站 α &lt; 1，方差项独占 KGE 亏损的 59.4%；跨域越远越严重（run A 0.72、run B 0.86、非洲 0.16）。这一天花板比迁移损失大一个数量级，是后续最值得投入的方向。</w:t>
+        <w:t>五、本文所训练模型的主要性能瓶颈是欠离散，且在迁移之前就已存在。M0 时 76.6% 的站 α &lt; 1，方差项独占 KGE 亏损的 59.4%；跨域越远越严重（run A 0.72、run B 0.86、非洲 0.16）。该瓶颈比迁移损失大一个数量级，是后续最值得投入的方向——但其中有多少来自缺失的遗忘门初始化尚未确定，见 §4.5。</w:t>
       </w:r>
     </w:p>
     <w:p>
@@ -6781,7 +6812,23 @@
         <w:pStyle w:val="ListBullet"/>
       </w:pPr>
       <w:r>
-        <w:t>超参为手工设定并冻结，PLAN 要求的 fold 1 超参搜索尚未进行；M2 符号先验（PLAN 标注为可选）尚未实现。</w:t>
+        <w:t>initial_forget_bias 在本报告全部运行中均未实现（见 §4.5）。对比结论不受影响，绝对水平与 α 的解释可能受影响；fold 1 搜索正在直接检验这一项。</w:t>
+      </w:r>
+    </w:p>
+    <w:p>
+      <w:pPr>
+        <w:pStyle w:val="ListBullet"/>
+      </w:pPr>
+      <w:r>
+        <w:t>M2 符号先验不予移植，此为有意决定：其表达式在 CAMELS-US 属性上拟合，全球对应列量纲相差 2–400 倍，且其中 PERMAVE（平均渗透率）在全球静态表中没有同物理量的列——NSIDC_permafrost 是多年冻土范围，属不同变量，而 cos(PERMAVE²) 对量纲极度敏感。更根本的是，该方法修正的是日分支偏差，而本工作诊断出的缺陷是小时尺度方差比，二者不是同一目标。PLAN 将 M2 标注为可选。</w:t>
+      </w:r>
+    </w:p>
+    <w:p>
+      <w:pPr>
+        <w:pStyle w:val="ListBullet"/>
+      </w:pPr>
+      <w:r>
+        <w:t>fold 1 超参搜索正在进行（26 个组合，含对齐 Gauch 官方实现的 7 个）。此前所有结果使用手工设定并冻结的超参，以保证各配置可比。</w:t>
       </w:r>
     </w:p>
     <w:p>

</xml_diff>

<commit_message>
Config: set initial_forget_bias to 3, and mark existing results as predating it
The base configuration now carries the published value, since it is part of the method
rather than a tuning knob. Reproducing the existing numbers exactly requires setting it
back to null, which is stated where those numbers appear.

Co-Authored-By: Claude Opus 5 <noreply@anthropic.com>
</commit_message>
<xml_diff>
--- a/reports/PhaseI_report.docx
+++ b/reports/PhaseI_report.docx
@@ -26,6 +26,21 @@
           <w:sz w:val="17"/>
         </w:rPr>
         <w:t>本文所有数值由 scripts/build_report.py 直接从结果文件读取生成，未人工转录。</w:t>
+      </w:r>
+    </w:p>
+    <w:p>
+      <w:r>
+        <w:rPr>
+          <w:b/>
+          <w:sz w:val="19"/>
+        </w:rPr>
+        <w:t>状态说明（2026-08-15）：</w:t>
+      </w:r>
+      <w:r>
+        <w:rPr>
+          <w:sz w:val="19"/>
+        </w:rPr>
+        <w:t>本报告全部数值均在缺少 initial_forget_bias 的情况下产生。Gauch 等人已发表的 MTS-LSTM 将其设为 3，而本实现及其所依据的 100 站参考实现均无此项。基础配置现已设为 3——它属于已发表方法的组成部分，而非调参旋钮；若要精确复现本报告数值，需将其设回 null。fold 1 搜索正在分离其单独效应（g03_forgetbias_H72、g04_forgetbias_H168），之后将带遗忘门、并结合搜索中明确更优的超参，对核心对比做一次性重跑。本报告的对比类结论不受影响（所有运行使用同一初始化），可能变动的是绝对水平，以及把 α 解释为根本天花板这一点。</w:t>
       </w:r>
     </w:p>
     <w:p>

</xml_diff>

<commit_message>
Africa: implement the full Phase I protocol in situ on African daily observations
The existing African result applies a model fine-tuned on temperate gauges to Africa, which
tests extrapolation rather than the method. Those 294 catchments have daily observations
and no hourly observations -- Phase I's premise occurring naturally -- so the stronger
experiment is to run the protocol there directly.

Adds AfricaWindowDataset mirroring the global one, and train/africa_transfer.py with two
loud guards: the standardised target mean must fall within +-5, and M0's alpha must lie in
0.05-20. Both exist because this class of failure produces plausible numbers rather than an
error.

Co-Authored-By: Claude Opus 5 <noreply@anthropic.com>
</commit_message>
<xml_diff>
--- a/reports/PhaseI_report.docx
+++ b/reports/PhaseI_report.docx
@@ -6744,6 +6744,930 @@
     </w:p>
     <w:p>
       <w:pPr>
+        <w:pStyle w:val="Heading2"/>
+      </w:pPr>
+      <w:r>
+        <w:t>4.6 空间分块的跌幅不是折构成造成的（逐站配对）</w:t>
+      </w:r>
+    </w:p>
+    <w:p>
+      <w:r>
+        <w:t>空间分块必然使折构成不均衡（30 个机构×折组合中 6 个为空），因此“M0 下降”会被质疑为两套划分打分的是不同的流域组合。5 折设计恰好能回答这个质疑：每个站在两套划分里各当过一次目标站，因此可以逐站配对，构成差异从构造上被固定。</w:t>
+      </w:r>
+    </w:p>
+    <w:p>
+      <w:r>
+        <w:rPr>
+          <w:b/>
+          <w:sz w:val="18"/>
+        </w:rPr>
+        <w:t>表 4-6　随机划分 vs 空间分块，逐站配对</w:t>
+      </w:r>
+    </w:p>
+    <w:tbl>
+      <w:tblPr>
+        <w:tblStyle w:val="LightGrid-Accent1"/>
+        <w:tblW w:type="auto" w:w="0"/>
+        <w:jc w:val="center"/>
+        <w:tblLook w:firstColumn="1" w:firstRow="1" w:lastColumn="0" w:lastRow="0" w:noHBand="0" w:noVBand="1" w:val="04A0"/>
+      </w:tblPr>
+      <w:tblGrid>
+        <w:gridCol w:w="4320"/>
+        <w:gridCol w:w="4320"/>
+      </w:tblGrid>
+      <w:tr>
+        <w:tc>
+          <w:tcPr>
+            <w:tcW w:type="dxa" w:w="2880"/>
+          </w:tcPr>
+          <w:p>
+            <w:r>
+              <w:rPr>
+                <w:b/>
+                <w:sz w:val="17"/>
+              </w:rPr>
+              <w:t>统计量</w:t>
+            </w:r>
+          </w:p>
+        </w:tc>
+        <w:tc>
+          <w:tcPr>
+            <w:tcW w:type="dxa" w:w="5760"/>
+          </w:tcPr>
+          <w:p>
+            <w:r>
+              <w:rPr>
+                <w:b/>
+                <w:sz w:val="17"/>
+              </w:rPr>
+              <w:t>值</w:t>
+            </w:r>
+          </w:p>
+        </w:tc>
+      </w:tr>
+      <w:tr>
+        <w:tc>
+          <w:tcPr>
+            <w:tcW w:type="dxa" w:w="2880"/>
+          </w:tcPr>
+          <w:p>
+            <w:pPr>
+              <w:jc w:val="center"/>
+            </w:pPr>
+            <w:r>
+              <w:rPr>
+                <w:sz w:val="17"/>
+              </w:rPr>
+              <w:t>配对流域数</w:t>
+            </w:r>
+          </w:p>
+        </w:tc>
+        <w:tc>
+          <w:tcPr>
+            <w:tcW w:type="dxa" w:w="5760"/>
+          </w:tcPr>
+          <w:p>
+            <w:pPr>
+              <w:jc w:val="center"/>
+            </w:pPr>
+            <w:r>
+              <w:rPr>
+                <w:sz w:val="17"/>
+              </w:rPr>
+              <w:t>8,709</w:t>
+            </w:r>
+          </w:p>
+        </w:tc>
+      </w:tr>
+      <w:tr>
+        <w:tc>
+          <w:tcPr>
+            <w:tcW w:type="dxa" w:w="2880"/>
+          </w:tcPr>
+          <w:p>
+            <w:pPr>
+              <w:jc w:val="center"/>
+            </w:pPr>
+            <w:r>
+              <w:rPr>
+                <w:sz w:val="17"/>
+              </w:rPr>
+              <w:t>中位 KGE 随机 → 分块</w:t>
+            </w:r>
+          </w:p>
+        </w:tc>
+        <w:tc>
+          <w:tcPr>
+            <w:tcW w:type="dxa" w:w="5760"/>
+          </w:tcPr>
+          <w:p>
+            <w:pPr>
+              <w:jc w:val="center"/>
+            </w:pPr>
+            <w:r>
+              <w:rPr>
+                <w:sz w:val="17"/>
+              </w:rPr>
+              <w:t>0.5396 → 0.4185</w:t>
+            </w:r>
+          </w:p>
+        </w:tc>
+      </w:tr>
+      <w:tr>
+        <w:tc>
+          <w:tcPr>
+            <w:tcW w:type="dxa" w:w="2880"/>
+          </w:tcPr>
+          <w:p>
+            <w:pPr>
+              <w:jc w:val="center"/>
+            </w:pPr>
+            <w:r>
+              <w:rPr>
+                <w:sz w:val="17"/>
+              </w:rPr>
+              <w:t>中位数之差</w:t>
+            </w:r>
+          </w:p>
+        </w:tc>
+        <w:tc>
+          <w:tcPr>
+            <w:tcW w:type="dxa" w:w="5760"/>
+          </w:tcPr>
+          <w:p>
+            <w:pPr>
+              <w:jc w:val="center"/>
+            </w:pPr>
+            <w:r>
+              <w:rPr>
+                <w:sz w:val="17"/>
+              </w:rPr>
+              <w:t>-0.1212</w:t>
+            </w:r>
+          </w:p>
+        </w:tc>
+      </w:tr>
+      <w:tr>
+        <w:tc>
+          <w:tcPr>
+            <w:tcW w:type="dxa" w:w="2880"/>
+          </w:tcPr>
+          <w:p>
+            <w:pPr>
+              <w:jc w:val="center"/>
+            </w:pPr>
+            <w:r>
+              <w:rPr>
+                <w:sz w:val="17"/>
+              </w:rPr>
+              <w:t>逐站配对中位跌幅</w:t>
+            </w:r>
+          </w:p>
+        </w:tc>
+        <w:tc>
+          <w:tcPr>
+            <w:tcW w:type="dxa" w:w="5760"/>
+          </w:tcPr>
+          <w:p>
+            <w:pPr>
+              <w:jc w:val="center"/>
+            </w:pPr>
+            <w:r>
+              <w:rPr>
+                <w:sz w:val="17"/>
+              </w:rPr>
+              <w:t>-0.0780（65.6% 的站变差，p=6.9e-224）</w:t>
+            </w:r>
+          </w:p>
+        </w:tc>
+      </w:tr>
+    </w:tbl>
+    <w:p/>
+    <w:p>
+      <w:r>
+        <w:rPr>
+          <w:i/>
+          <w:color w:val="595959"/>
+          <w:sz w:val="17"/>
+        </w:rPr>
+        <w:t>注：两者是不同估计量，本文其他处引用过中位数之差；配对值更严格，应作为头条数字。</w:t>
+      </w:r>
+    </w:p>
+    <w:p>
+      <w:r>
+        <w:rPr>
+          <w:b/>
+          <w:sz w:val="18"/>
+        </w:rPr>
+        <w:t>表 4-7　按来源机构分层的配对跌幅</w:t>
+      </w:r>
+    </w:p>
+    <w:tbl>
+      <w:tblPr>
+        <w:tblStyle w:val="LightGrid-Accent1"/>
+        <w:tblW w:type="auto" w:w="0"/>
+        <w:jc w:val="center"/>
+        <w:tblLook w:firstColumn="1" w:firstRow="1" w:lastColumn="0" w:lastRow="0" w:noHBand="0" w:noVBand="1" w:val="04A0"/>
+      </w:tblPr>
+      <w:tblGrid>
+        <w:gridCol w:w="1440"/>
+        <w:gridCol w:w="1440"/>
+        <w:gridCol w:w="1440"/>
+        <w:gridCol w:w="1440"/>
+        <w:gridCol w:w="1440"/>
+        <w:gridCol w:w="1440"/>
+      </w:tblGrid>
+      <w:tr>
+        <w:tc>
+          <w:tcPr>
+            <w:tcW w:type="dxa" w:w="2016"/>
+          </w:tcPr>
+          <w:p>
+            <w:r>
+              <w:rPr>
+                <w:b/>
+                <w:sz w:val="17"/>
+              </w:rPr>
+              <w:t>机构</w:t>
+            </w:r>
+          </w:p>
+        </w:tc>
+        <w:tc>
+          <w:tcPr>
+            <w:tcW w:type="dxa" w:w="1152"/>
+          </w:tcPr>
+          <w:p>
+            <w:r>
+              <w:rPr>
+                <w:b/>
+                <w:sz w:val="17"/>
+              </w:rPr>
+              <w:t>站数</w:t>
+            </w:r>
+          </w:p>
+        </w:tc>
+        <w:tc>
+          <w:tcPr>
+            <w:tcW w:type="dxa" w:w="1296"/>
+          </w:tcPr>
+          <w:p>
+            <w:r>
+              <w:rPr>
+                <w:b/>
+                <w:sz w:val="17"/>
+              </w:rPr>
+              <w:t>随机</w:t>
+            </w:r>
+          </w:p>
+        </w:tc>
+        <w:tc>
+          <w:tcPr>
+            <w:tcW w:type="dxa" w:w="1296"/>
+          </w:tcPr>
+          <w:p>
+            <w:r>
+              <w:rPr>
+                <w:b/>
+                <w:sz w:val="17"/>
+              </w:rPr>
+              <w:t>分块</w:t>
+            </w:r>
+          </w:p>
+        </w:tc>
+        <w:tc>
+          <w:tcPr>
+            <w:tcW w:type="dxa" w:w="1440"/>
+          </w:tcPr>
+          <w:p>
+            <w:r>
+              <w:rPr>
+                <w:b/>
+                <w:sz w:val="17"/>
+              </w:rPr>
+              <w:t>配对跌幅</w:t>
+            </w:r>
+          </w:p>
+        </w:tc>
+        <w:tc>
+          <w:tcPr>
+            <w:tcW w:type="dxa" w:w="1440"/>
+          </w:tcPr>
+          <w:p>
+            <w:r>
+              <w:rPr>
+                <w:b/>
+                <w:sz w:val="17"/>
+              </w:rPr>
+              <w:t>变差占比</w:t>
+            </w:r>
+          </w:p>
+        </w:tc>
+      </w:tr>
+      <w:tr>
+        <w:tc>
+          <w:tcPr>
+            <w:tcW w:type="dxa" w:w="2016"/>
+          </w:tcPr>
+          <w:p>
+            <w:pPr>
+              <w:jc w:val="center"/>
+            </w:pPr>
+            <w:r>
+              <w:rPr>
+                <w:sz w:val="17"/>
+              </w:rPr>
+              <w:t>BOMAustralia</w:t>
+            </w:r>
+          </w:p>
+        </w:tc>
+        <w:tc>
+          <w:tcPr>
+            <w:tcW w:type="dxa" w:w="1152"/>
+          </w:tcPr>
+          <w:p>
+            <w:pPr>
+              <w:jc w:val="center"/>
+            </w:pPr>
+            <w:r>
+              <w:rPr>
+                <w:sz w:val="17"/>
+              </w:rPr>
+              <w:t>1,607</w:t>
+            </w:r>
+          </w:p>
+        </w:tc>
+        <w:tc>
+          <w:tcPr>
+            <w:tcW w:type="dxa" w:w="1296"/>
+          </w:tcPr>
+          <w:p>
+            <w:pPr>
+              <w:jc w:val="center"/>
+            </w:pPr>
+            <w:r>
+              <w:rPr>
+                <w:sz w:val="17"/>
+              </w:rPr>
+              <w:t>0.2281</w:t>
+            </w:r>
+          </w:p>
+        </w:tc>
+        <w:tc>
+          <w:tcPr>
+            <w:tcW w:type="dxa" w:w="1296"/>
+          </w:tcPr>
+          <w:p>
+            <w:pPr>
+              <w:jc w:val="center"/>
+            </w:pPr>
+            <w:r>
+              <w:rPr>
+                <w:sz w:val="17"/>
+              </w:rPr>
+              <w:t>0.1024</w:t>
+            </w:r>
+          </w:p>
+        </w:tc>
+        <w:tc>
+          <w:tcPr>
+            <w:tcW w:type="dxa" w:w="1440"/>
+          </w:tcPr>
+          <w:p>
+            <w:pPr>
+              <w:jc w:val="center"/>
+            </w:pPr>
+            <w:r>
+              <w:rPr>
+                <w:sz w:val="17"/>
+              </w:rPr>
+              <w:t>-0.0746</w:t>
+            </w:r>
+          </w:p>
+        </w:tc>
+        <w:tc>
+          <w:tcPr>
+            <w:tcW w:type="dxa" w:w="1440"/>
+          </w:tcPr>
+          <w:p>
+            <w:pPr>
+              <w:jc w:val="center"/>
+            </w:pPr>
+            <w:r>
+              <w:rPr>
+                <w:sz w:val="17"/>
+              </w:rPr>
+              <w:t>58.8%</w:t>
+            </w:r>
+          </w:p>
+        </w:tc>
+      </w:tr>
+      <w:tr>
+        <w:tc>
+          <w:tcPr>
+            <w:tcW w:type="dxa" w:w="2016"/>
+          </w:tcPr>
+          <w:p>
+            <w:pPr>
+              <w:jc w:val="center"/>
+            </w:pPr>
+            <w:r>
+              <w:rPr>
+                <w:sz w:val="17"/>
+              </w:rPr>
+              <w:t>CAMELSH</w:t>
+            </w:r>
+          </w:p>
+        </w:tc>
+        <w:tc>
+          <w:tcPr>
+            <w:tcW w:type="dxa" w:w="1152"/>
+          </w:tcPr>
+          <w:p>
+            <w:pPr>
+              <w:jc w:val="center"/>
+            </w:pPr>
+            <w:r>
+              <w:rPr>
+                <w:sz w:val="17"/>
+              </w:rPr>
+              <w:t>5,047</w:t>
+            </w:r>
+          </w:p>
+        </w:tc>
+        <w:tc>
+          <w:tcPr>
+            <w:tcW w:type="dxa" w:w="1296"/>
+          </w:tcPr>
+          <w:p>
+            <w:pPr>
+              <w:jc w:val="center"/>
+            </w:pPr>
+            <w:r>
+              <w:rPr>
+                <w:sz w:val="17"/>
+              </w:rPr>
+              <w:t>0.5856</w:t>
+            </w:r>
+          </w:p>
+        </w:tc>
+        <w:tc>
+          <w:tcPr>
+            <w:tcW w:type="dxa" w:w="1296"/>
+          </w:tcPr>
+          <w:p>
+            <w:pPr>
+              <w:jc w:val="center"/>
+            </w:pPr>
+            <w:r>
+              <w:rPr>
+                <w:sz w:val="17"/>
+              </w:rPr>
+              <w:t>0.4794</w:t>
+            </w:r>
+          </w:p>
+        </w:tc>
+        <w:tc>
+          <w:tcPr>
+            <w:tcW w:type="dxa" w:w="1440"/>
+          </w:tcPr>
+          <w:p>
+            <w:pPr>
+              <w:jc w:val="center"/>
+            </w:pPr>
+            <w:r>
+              <w:rPr>
+                <w:sz w:val="17"/>
+              </w:rPr>
+              <w:t>-0.0664</w:t>
+            </w:r>
+          </w:p>
+        </w:tc>
+        <w:tc>
+          <w:tcPr>
+            <w:tcW w:type="dxa" w:w="1440"/>
+          </w:tcPr>
+          <w:p>
+            <w:pPr>
+              <w:jc w:val="center"/>
+            </w:pPr>
+            <w:r>
+              <w:rPr>
+                <w:sz w:val="17"/>
+              </w:rPr>
+              <w:t>66.4%</w:t>
+            </w:r>
+          </w:p>
+        </w:tc>
+      </w:tr>
+      <w:tr>
+        <w:tc>
+          <w:tcPr>
+            <w:tcW w:type="dxa" w:w="2016"/>
+          </w:tcPr>
+          <w:p>
+            <w:pPr>
+              <w:jc w:val="center"/>
+            </w:pPr>
+            <w:r>
+              <w:rPr>
+                <w:sz w:val="17"/>
+              </w:rPr>
+              <w:t>Germany</w:t>
+            </w:r>
+          </w:p>
+        </w:tc>
+        <w:tc>
+          <w:tcPr>
+            <w:tcW w:type="dxa" w:w="1152"/>
+          </w:tcPr>
+          <w:p>
+            <w:pPr>
+              <w:jc w:val="center"/>
+            </w:pPr>
+            <w:r>
+              <w:rPr>
+                <w:sz w:val="17"/>
+              </w:rPr>
+              <w:t>458</w:t>
+            </w:r>
+          </w:p>
+        </w:tc>
+        <w:tc>
+          <w:tcPr>
+            <w:tcW w:type="dxa" w:w="1296"/>
+          </w:tcPr>
+          <w:p>
+            <w:pPr>
+              <w:jc w:val="center"/>
+            </w:pPr>
+            <w:r>
+              <w:rPr>
+                <w:sz w:val="17"/>
+              </w:rPr>
+              <w:t>0.6146</w:t>
+            </w:r>
+          </w:p>
+        </w:tc>
+        <w:tc>
+          <w:tcPr>
+            <w:tcW w:type="dxa" w:w="1296"/>
+          </w:tcPr>
+          <w:p>
+            <w:pPr>
+              <w:jc w:val="center"/>
+            </w:pPr>
+            <w:r>
+              <w:rPr>
+                <w:sz w:val="17"/>
+              </w:rPr>
+              <w:t>0.5077</w:t>
+            </w:r>
+          </w:p>
+        </w:tc>
+        <w:tc>
+          <w:tcPr>
+            <w:tcW w:type="dxa" w:w="1440"/>
+          </w:tcPr>
+          <w:p>
+            <w:pPr>
+              <w:jc w:val="center"/>
+            </w:pPr>
+            <w:r>
+              <w:rPr>
+                <w:sz w:val="17"/>
+              </w:rPr>
+              <w:t>-0.0627</w:t>
+            </w:r>
+          </w:p>
+        </w:tc>
+        <w:tc>
+          <w:tcPr>
+            <w:tcW w:type="dxa" w:w="1440"/>
+          </w:tcPr>
+          <w:p>
+            <w:pPr>
+              <w:jc w:val="center"/>
+            </w:pPr>
+            <w:r>
+              <w:rPr>
+                <w:sz w:val="17"/>
+              </w:rPr>
+              <w:t>61.4%</w:t>
+            </w:r>
+          </w:p>
+        </w:tc>
+      </w:tr>
+      <w:tr>
+        <w:tc>
+          <w:tcPr>
+            <w:tcW w:type="dxa" w:w="2016"/>
+          </w:tcPr>
+          <w:p>
+            <w:pPr>
+              <w:jc w:val="center"/>
+            </w:pPr>
+            <w:r>
+              <w:rPr>
+                <w:sz w:val="17"/>
+              </w:rPr>
+              <w:t>Japan</w:t>
+            </w:r>
+          </w:p>
+        </w:tc>
+        <w:tc>
+          <w:tcPr>
+            <w:tcW w:type="dxa" w:w="1152"/>
+          </w:tcPr>
+          <w:p>
+            <w:pPr>
+              <w:jc w:val="center"/>
+            </w:pPr>
+            <w:r>
+              <w:rPr>
+                <w:sz w:val="17"/>
+              </w:rPr>
+              <w:t>690</w:t>
+            </w:r>
+          </w:p>
+        </w:tc>
+        <w:tc>
+          <w:tcPr>
+            <w:tcW w:type="dxa" w:w="1296"/>
+          </w:tcPr>
+          <w:p>
+            <w:pPr>
+              <w:jc w:val="center"/>
+            </w:pPr>
+            <w:r>
+              <w:rPr>
+                <w:sz w:val="17"/>
+              </w:rPr>
+              <w:t>0.5697</w:t>
+            </w:r>
+          </w:p>
+        </w:tc>
+        <w:tc>
+          <w:tcPr>
+            <w:tcW w:type="dxa" w:w="1296"/>
+          </w:tcPr>
+          <w:p>
+            <w:pPr>
+              <w:jc w:val="center"/>
+            </w:pPr>
+            <w:r>
+              <w:rPr>
+                <w:sz w:val="17"/>
+              </w:rPr>
+              <w:t>0.4017</w:t>
+            </w:r>
+          </w:p>
+        </w:tc>
+        <w:tc>
+          <w:tcPr>
+            <w:tcW w:type="dxa" w:w="1440"/>
+          </w:tcPr>
+          <w:p>
+            <w:pPr>
+              <w:jc w:val="center"/>
+            </w:pPr>
+            <w:r>
+              <w:rPr>
+                <w:sz w:val="17"/>
+              </w:rPr>
+              <w:t>-0.1205</w:t>
+            </w:r>
+          </w:p>
+        </w:tc>
+        <w:tc>
+          <w:tcPr>
+            <w:tcW w:type="dxa" w:w="1440"/>
+          </w:tcPr>
+          <w:p>
+            <w:pPr>
+              <w:jc w:val="center"/>
+            </w:pPr>
+            <w:r>
+              <w:rPr>
+                <w:sz w:val="17"/>
+              </w:rPr>
+              <w:t>73.8%</w:t>
+            </w:r>
+          </w:p>
+        </w:tc>
+      </w:tr>
+      <w:tr>
+        <w:tc>
+          <w:tcPr>
+            <w:tcW w:type="dxa" w:w="2016"/>
+          </w:tcPr>
+          <w:p>
+            <w:pPr>
+              <w:jc w:val="center"/>
+            </w:pPr>
+            <w:r>
+              <w:rPr>
+                <w:sz w:val="17"/>
+              </w:rPr>
+              <w:t>LamaHCE</w:t>
+            </w:r>
+          </w:p>
+        </w:tc>
+        <w:tc>
+          <w:tcPr>
+            <w:tcW w:type="dxa" w:w="1152"/>
+          </w:tcPr>
+          <w:p>
+            <w:pPr>
+              <w:jc w:val="center"/>
+            </w:pPr>
+            <w:r>
+              <w:rPr>
+                <w:sz w:val="17"/>
+              </w:rPr>
+              <w:t>834</w:t>
+            </w:r>
+          </w:p>
+        </w:tc>
+        <w:tc>
+          <w:tcPr>
+            <w:tcW w:type="dxa" w:w="1296"/>
+          </w:tcPr>
+          <w:p>
+            <w:pPr>
+              <w:jc w:val="center"/>
+            </w:pPr>
+            <w:r>
+              <w:rPr>
+                <w:sz w:val="17"/>
+              </w:rPr>
+              <w:t>0.5922</w:t>
+            </w:r>
+          </w:p>
+        </w:tc>
+        <w:tc>
+          <w:tcPr>
+            <w:tcW w:type="dxa" w:w="1296"/>
+          </w:tcPr>
+          <w:p>
+            <w:pPr>
+              <w:jc w:val="center"/>
+            </w:pPr>
+            <w:r>
+              <w:rPr>
+                <w:sz w:val="17"/>
+              </w:rPr>
+              <w:t>0.4504</w:t>
+            </w:r>
+          </w:p>
+        </w:tc>
+        <w:tc>
+          <w:tcPr>
+            <w:tcW w:type="dxa" w:w="1440"/>
+          </w:tcPr>
+          <w:p>
+            <w:pPr>
+              <w:jc w:val="center"/>
+            </w:pPr>
+            <w:r>
+              <w:rPr>
+                <w:sz w:val="17"/>
+              </w:rPr>
+              <w:t>-0.1337</w:t>
+            </w:r>
+          </w:p>
+        </w:tc>
+        <w:tc>
+          <w:tcPr>
+            <w:tcW w:type="dxa" w:w="1440"/>
+          </w:tcPr>
+          <w:p>
+            <w:pPr>
+              <w:jc w:val="center"/>
+            </w:pPr>
+            <w:r>
+              <w:rPr>
+                <w:sz w:val="17"/>
+              </w:rPr>
+              <w:t>69.1%</w:t>
+            </w:r>
+          </w:p>
+        </w:tc>
+      </w:tr>
+      <w:tr>
+        <w:tc>
+          <w:tcPr>
+            <w:tcW w:type="dxa" w:w="2016"/>
+          </w:tcPr>
+          <w:p>
+            <w:pPr>
+              <w:jc w:val="center"/>
+            </w:pPr>
+            <w:r>
+              <w:rPr>
+                <w:sz w:val="17"/>
+              </w:rPr>
+              <w:t>LamaHIce</w:t>
+            </w:r>
+          </w:p>
+        </w:tc>
+        <w:tc>
+          <w:tcPr>
+            <w:tcW w:type="dxa" w:w="1152"/>
+          </w:tcPr>
+          <w:p>
+            <w:pPr>
+              <w:jc w:val="center"/>
+            </w:pPr>
+            <w:r>
+              <w:rPr>
+                <w:sz w:val="17"/>
+              </w:rPr>
+              <w:t>73</w:t>
+            </w:r>
+          </w:p>
+        </w:tc>
+        <w:tc>
+          <w:tcPr>
+            <w:tcW w:type="dxa" w:w="1296"/>
+          </w:tcPr>
+          <w:p>
+            <w:pPr>
+              <w:jc w:val="center"/>
+            </w:pPr>
+            <w:r>
+              <w:rPr>
+                <w:sz w:val="17"/>
+              </w:rPr>
+              <w:t>0.3039</w:t>
+            </w:r>
+          </w:p>
+        </w:tc>
+        <w:tc>
+          <w:tcPr>
+            <w:tcW w:type="dxa" w:w="1296"/>
+          </w:tcPr>
+          <w:p>
+            <w:pPr>
+              <w:jc w:val="center"/>
+            </w:pPr>
+            <w:r>
+              <w:rPr>
+                <w:sz w:val="17"/>
+              </w:rPr>
+              <w:t>0.1018</w:t>
+            </w:r>
+          </w:p>
+        </w:tc>
+        <w:tc>
+          <w:tcPr>
+            <w:tcW w:type="dxa" w:w="1440"/>
+          </w:tcPr>
+          <w:p>
+            <w:pPr>
+              <w:jc w:val="center"/>
+            </w:pPr>
+            <w:r>
+              <w:rPr>
+                <w:sz w:val="17"/>
+              </w:rPr>
+              <w:t>-0.2457</w:t>
+            </w:r>
+          </w:p>
+        </w:tc>
+        <w:tc>
+          <w:tcPr>
+            <w:tcW w:type="dxa" w:w="1440"/>
+          </w:tcPr>
+          <w:p>
+            <w:pPr>
+              <w:jc w:val="center"/>
+            </w:pPr>
+            <w:r>
+              <w:rPr>
+                <w:sz w:val="17"/>
+              </w:rPr>
+              <w:t>69.9%</w:t>
+            </w:r>
+          </w:p>
+        </w:tc>
+      </w:tr>
+    </w:tbl>
+    <w:p/>
+    <w:p>
+      <w:r>
+        <w:rPr>
+          <w:b/>
+        </w:rPr>
+        <w:t>六家机构无一例外全部下降——这是构成假象无法产生的结果，因此“折构成变化”这一替代解释被排除。</w:t>
+      </w:r>
+    </w:p>
+    <w:p>
+      <w:r>
+        <w:t>跨机构的跌幅差异本身也是一项发现：对空间邻近的依赖程度与台网密度成反比。美国贡献 5,767 个站，分块后源域中仍有大量可比流域，跌幅最小（−0.066）；冰岛只有 73 个站且地理孤立，整块移除后源域中几乎没有相似流域，跌幅达 −0.246，接近四倍。台网稀疏处随机划分的乐观偏差最严重——而那恰恰是本方法最想服务的地区。</w:t>
+      </w:r>
+    </w:p>
+    <w:p>
+      <w:pPr>
         <w:pStyle w:val="Heading1"/>
       </w:pPr>
       <w:r>
@@ -6803,7 +7727,119 @@
         <w:pStyle w:val="Heading1"/>
       </w:pPr>
       <w:r>
-        <w:t>6. 已知局限与未完成项</w:t>
+        <w:t>6. 已知局限与应对</w:t>
+      </w:r>
+    </w:p>
+    <w:p>
+      <w:r>
+        <w:t>以下四条是本工作已识别、且预计会被审稿人首先质疑的问题。逐条给出现状、已做的量化，以及是否需要补充实验。</w:t>
+      </w:r>
+    </w:p>
+    <w:p>
+      <w:pPr>
+        <w:pStyle w:val="Heading2"/>
+      </w:pPr>
+      <w:r>
+        <w:t>6.1 时间划分为两段而非三段</w:t>
+      </w:r>
+    </w:p>
+    <w:p>
+      <w:r>
+        <w:t>现状：每站按自身记录时序 70%/30% 切分，报告的是验证期内与早停集不相交的留出样本，而非时间上独立的测试期。PLAN 原定三段（train 2000–2012 / val 2013–2015 / test 2016–2020），实际未采用，原因是预备批次本身即按 0.7/0.3 切分，run B 沿用同一划分以保证两条数据路径可比。</w:t>
+      </w:r>
+    </w:p>
+    <w:p>
+      <w:r>
+        <w:t>已量化的影响：跨折统计，最优 epoch 相对末轮的增益仅 +0.0063（随机划分）与 +0.0036（分块划分），后十轮极差 0.014–0.017。即使早停完全“看穿”验证期，可得收益上限约 0.006 KGE，比本文所报效应（0.078 / 0.064 / 0.165）低一到两个数量级。</w:t>
+      </w:r>
+    </w:p>
+    <w:p>
+      <w:r>
+        <w:t>分数字看：目标域 M0、M1 及其差不受影响——迁移阶段的早停只使用目标域训练期留出集上的日聚合 KGE，目标域验证期从未参与选择；受影响的是源域 STEP 3 数字，其选择与报告使用同站同期。应对：如实表述为“验证期留出样本”，不称 test；源域退化数字标注偏乐观。补充实验非必要，若审稿人坚持，只需对最终配置重做一次三段划分。</w:t>
+      </w:r>
+    </w:p>
+    <w:p>
+      <w:pPr>
+        <w:pStyle w:val="Heading2"/>
+      </w:pPr>
+      <w:r>
+        <w:t>6.2 空间分块的折构成不均衡</w:t>
+      </w:r>
+    </w:p>
+    <w:p>
+      <w:r>
+        <w:t>现状：空间分块必然使折构成不均衡（30 个机构×折组合中 6 个为空，美国站占比在折间从 40% 到 73%）。去掉近邻必然去掉该区域，这是方法的固有代价，无法通过调整块数消除（块数从 60 增到 240 时，隔离度从 140 km 降到 64 km，而构成均衡度只是相应改善）。</w:t>
+      </w:r>
+    </w:p>
+    <w:p>
+      <w:r>
+        <w:rPr>
+          <w:b/>
+        </w:rPr>
+        <w:t>应对：已通过逐站配对排除（见 §4.6）。</w:t>
+      </w:r>
+      <w:r>
+        <w:t>同一批 8,709 个流域在两套划分中各当过一次目标站，配对比较使构成差异从构造上被固定；六家机构内部无一例外全部下降。因此该混淆已被排除，无需补充实验。</w:t>
+      </w:r>
+    </w:p>
+    <w:p>
+      <w:pPr>
+        <w:pStyle w:val="Heading2"/>
+      </w:pPr>
+      <w:r>
+        <w:t>6.3 KGE 改善而绝对误差略微变差</w:t>
+      </w:r>
+    </w:p>
+    <w:p>
+      <w:r>
+        <w:t>现状：站级配对检验显示，BH-FDR 校正后 91.6% 的站变化显著，但方向分裂——以绝对误差衡量，变差的站（49.7%）多于改善的站（41.9%），全站中位误差变化 −0.00019 mm/h。KGE 变好的站占 54.6%，误差变小的站仅 46.5%，两者同向的站仅 67.5%。</w:t>
+      </w:r>
+    </w:p>
+    <w:p>
+      <w:r>
+        <w:t>这不是缺陷而是指标选择的必然后果：提高 α（预测方差比）会改善 KGE，而绝对误差在预测更靠近条件中位数时最小，两者要求相反。日聚合监督使水文过程线更接近观测的水量（1.01 倍）、方差比与日内形状，但不提升逐点精度。</w:t>
+      </w:r>
+    </w:p>
+    <w:p>
+      <w:r>
+        <w:rPr>
+          <w:b/>
+        </w:rPr>
+        <w:t>应对：主结论一律表述为“标定改善”而非“精度改善”，并同时报告两个指标。主动交代优于被发现，且这一区分本身对读者有价值。</w:t>
+      </w:r>
+    </w:p>
+    <w:p>
+      <w:pPr>
+        <w:pStyle w:val="Heading2"/>
+      </w:pPr>
+      <w:r>
+        <w:t>6.4 非洲实验所用协议不是最强形态</w:t>
+      </w:r>
+    </w:p>
+    <w:p>
+      <w:r>
+        <w:t>现状：本文的非洲评估是把在温带目标站上微调过的模型套用到非洲流域。而非洲这 294 个流域“有日观测、无小时观测”，恰恰就是 Phase I 前提的自然发生形态，因此更强的实验是直接在非洲日观测上微调、再在非洲留出期评估。</w:t>
+      </w:r>
+    </w:p>
+    <w:p>
+      <w:r>
+        <w:t>这是方法学上的弱点而非数据限制——非洲日观测已经具备（282/294 个流域在强迫覆盖期内有超过 365 天观测，中位 3,926 天）。未做的原因是迁移流程尚需支持把非洲流域作为目标域。</w:t>
+      </w:r>
+    </w:p>
+    <w:p>
+      <w:r>
+        <w:rPr>
+          <w:b/>
+        </w:rPr>
+        <w:t>应对：建议补做。代价为一次迁移训练（约 1 小时，复用已有预训练权重），不需重新预训练。在补做之前，现有非洲结果应表述为“温带微调模型的跨大洲外推”，而非“Phase I 方法在非洲的验证”。</w:t>
+      </w:r>
+    </w:p>
+    <w:p>
+      <w:pPr>
+        <w:pStyle w:val="Heading1"/>
+      </w:pPr>
+      <w:r>
+        <w:t>7. 其它未完成项</w:t>
       </w:r>
     </w:p>
     <w:p>

</xml_diff>

<commit_message>
Report: add the in-situ African validation and the blocked split's mechanism
Co-Authored-By: Claude Opus 5 <noreply@anthropic.com>
</commit_message>
<xml_diff>
--- a/reports/PhaseI_report.docx
+++ b/reports/PhaseI_report.docx
@@ -3489,6 +3489,869 @@
           <w:sz w:val="17"/>
         </w:rPr>
         <w:t>强迫数据处理：ERA5-Land 的 potential_evaporation 与训练所用 Penman PET 不是同一个量，在这 294 个流域上前者是后者的 2.29 倍（3978 vs 1737 mm/yr），标准化后落在 z = +2.54、30.8% 的小时超过 z = 3。因此保留 ERA5-Land 的日内形状、量级取自训练产品，重标定后 z = +0.73，与气温的 +0.68 同量级。</w:t>
+      </w:r>
+    </w:p>
+    <w:p>
+      <w:pPr>
+        <w:pStyle w:val="Heading2"/>
+      </w:pPr>
+      <w:r>
+        <w:t>3.5 非洲原位验证：在非洲自己的日观测上微调</w:t>
+      </w:r>
+    </w:p>
+    <w:p>
+      <w:r>
+        <w:t>上述非洲结果是把在温带目标站上微调过的模型套用到非洲，检验的是外推能力而非方法本身。非洲这 294 个流域“有日观测、无小时观测”，恰恰就是 Phase I 前提在真实世界的形态，因此正确的做法是把协议直接搬过去：在全球源域预训练，用非洲训练期的日观测微调，在非洲留出期评估日尺度技巧。每个流域按自身记录时序 70/30 切分，与全球实验一致。</w:t>
+      </w:r>
+    </w:p>
+    <w:p>
+      <w:r>
+        <w:rPr>
+          <w:b/>
+          <w:sz w:val="18"/>
+        </w:rPr>
+        <w:t>表 3-2　非洲原位微调，五折（每折约 282 个流域）</w:t>
+      </w:r>
+    </w:p>
+    <w:tbl>
+      <w:tblPr>
+        <w:tblStyle w:val="LightGrid-Accent1"/>
+        <w:tblW w:type="auto" w:w="0"/>
+        <w:jc w:val="center"/>
+        <w:tblLook w:firstColumn="1" w:firstRow="1" w:lastColumn="0" w:lastRow="0" w:noHBand="0" w:noVBand="1" w:val="04A0"/>
+      </w:tblPr>
+      <w:tblGrid>
+        <w:gridCol w:w="1234"/>
+        <w:gridCol w:w="1234"/>
+        <w:gridCol w:w="1234"/>
+        <w:gridCol w:w="1234"/>
+        <w:gridCol w:w="1234"/>
+        <w:gridCol w:w="1234"/>
+        <w:gridCol w:w="1234"/>
+      </w:tblGrid>
+      <w:tr>
+        <w:tc>
+          <w:tcPr>
+            <w:tcW w:type="dxa" w:w="864"/>
+          </w:tcPr>
+          <w:p>
+            <w:r>
+              <w:rPr>
+                <w:b/>
+                <w:sz w:val="17"/>
+              </w:rPr>
+              <w:t>fold</w:t>
+            </w:r>
+          </w:p>
+        </w:tc>
+        <w:tc>
+          <w:tcPr>
+            <w:tcW w:type="dxa" w:w="1152"/>
+          </w:tcPr>
+          <w:p>
+            <w:r>
+              <w:rPr>
+                <w:b/>
+                <w:sz w:val="17"/>
+              </w:rPr>
+              <w:t>M0</w:t>
+            </w:r>
+          </w:p>
+        </w:tc>
+        <w:tc>
+          <w:tcPr>
+            <w:tcW w:type="dxa" w:w="1152"/>
+          </w:tcPr>
+          <w:p>
+            <w:r>
+              <w:rPr>
+                <w:b/>
+                <w:sz w:val="17"/>
+              </w:rPr>
+              <w:t>M1</w:t>
+            </w:r>
+          </w:p>
+        </w:tc>
+        <w:tc>
+          <w:tcPr>
+            <w:tcW w:type="dxa" w:w="1440"/>
+          </w:tcPr>
+          <w:p>
+            <w:r>
+              <w:rPr>
+                <w:b/>
+                <w:sz w:val="17"/>
+              </w:rPr>
+              <w:t>配对 ΔKGE</w:t>
+            </w:r>
+          </w:p>
+        </w:tc>
+        <w:tc>
+          <w:tcPr>
+            <w:tcW w:type="dxa" w:w="1296"/>
+          </w:tcPr>
+          <w:p>
+            <w:r>
+              <w:rPr>
+                <w:b/>
+                <w:sz w:val="17"/>
+              </w:rPr>
+              <w:t>改善占比</w:t>
+            </w:r>
+          </w:p>
+        </w:tc>
+        <w:tc>
+          <w:tcPr>
+            <w:tcW w:type="dxa" w:w="1584"/>
+          </w:tcPr>
+          <w:p>
+            <w:r>
+              <w:rPr>
+                <w:b/>
+                <w:sz w:val="17"/>
+              </w:rPr>
+              <w:t>α</w:t>
+            </w:r>
+          </w:p>
+        </w:tc>
+        <w:tc>
+          <w:tcPr>
+            <w:tcW w:type="dxa" w:w="1584"/>
+          </w:tcPr>
+          <w:p>
+            <w:r>
+              <w:rPr>
+                <w:b/>
+                <w:sz w:val="17"/>
+              </w:rPr>
+              <w:t>r</w:t>
+            </w:r>
+          </w:p>
+        </w:tc>
+      </w:tr>
+      <w:tr>
+        <w:tc>
+          <w:tcPr>
+            <w:tcW w:type="dxa" w:w="864"/>
+          </w:tcPr>
+          <w:p>
+            <w:pPr>
+              <w:jc w:val="center"/>
+            </w:pPr>
+            <w:r>
+              <w:rPr>
+                <w:sz w:val="17"/>
+              </w:rPr>
+              <w:t>0</w:t>
+            </w:r>
+          </w:p>
+        </w:tc>
+        <w:tc>
+          <w:tcPr>
+            <w:tcW w:type="dxa" w:w="1152"/>
+          </w:tcPr>
+          <w:p>
+            <w:pPr>
+              <w:jc w:val="center"/>
+            </w:pPr>
+            <w:r>
+              <w:rPr>
+                <w:sz w:val="17"/>
+              </w:rPr>
+              <w:t>-0.1308</w:t>
+            </w:r>
+          </w:p>
+        </w:tc>
+        <w:tc>
+          <w:tcPr>
+            <w:tcW w:type="dxa" w:w="1152"/>
+          </w:tcPr>
+          <w:p>
+            <w:pPr>
+              <w:jc w:val="center"/>
+            </w:pPr>
+            <w:r>
+              <w:rPr>
+                <w:sz w:val="17"/>
+              </w:rPr>
+              <w:t>0.4784</w:t>
+            </w:r>
+          </w:p>
+        </w:tc>
+        <w:tc>
+          <w:tcPr>
+            <w:tcW w:type="dxa" w:w="1440"/>
+          </w:tcPr>
+          <w:p>
+            <w:pPr>
+              <w:jc w:val="center"/>
+            </w:pPr>
+            <w:r>
+              <w:rPr>
+                <w:sz w:val="17"/>
+              </w:rPr>
+              <w:t>+0.6376</w:t>
+            </w:r>
+          </w:p>
+        </w:tc>
+        <w:tc>
+          <w:tcPr>
+            <w:tcW w:type="dxa" w:w="1296"/>
+          </w:tcPr>
+          <w:p>
+            <w:pPr>
+              <w:jc w:val="center"/>
+            </w:pPr>
+            <w:r>
+              <w:rPr>
+                <w:sz w:val="17"/>
+              </w:rPr>
+              <w:t>97.2%</w:t>
+            </w:r>
+          </w:p>
+        </w:tc>
+        <w:tc>
+          <w:tcPr>
+            <w:tcW w:type="dxa" w:w="1584"/>
+          </w:tcPr>
+          <w:p>
+            <w:pPr>
+              <w:jc w:val="center"/>
+            </w:pPr>
+            <w:r>
+              <w:rPr>
+                <w:sz w:val="17"/>
+              </w:rPr>
+              <w:t>0.159→0.793</w:t>
+            </w:r>
+          </w:p>
+        </w:tc>
+        <w:tc>
+          <w:tcPr>
+            <w:tcW w:type="dxa" w:w="1584"/>
+          </w:tcPr>
+          <w:p>
+            <w:pPr>
+              <w:jc w:val="center"/>
+            </w:pPr>
+            <w:r>
+              <w:rPr>
+                <w:sz w:val="17"/>
+              </w:rPr>
+              <w:t>0.612→0.779</w:t>
+            </w:r>
+          </w:p>
+        </w:tc>
+      </w:tr>
+      <w:tr>
+        <w:tc>
+          <w:tcPr>
+            <w:tcW w:type="dxa" w:w="864"/>
+          </w:tcPr>
+          <w:p>
+            <w:pPr>
+              <w:jc w:val="center"/>
+            </w:pPr>
+            <w:r>
+              <w:rPr>
+                <w:sz w:val="17"/>
+              </w:rPr>
+              <w:t>1</w:t>
+            </w:r>
+          </w:p>
+        </w:tc>
+        <w:tc>
+          <w:tcPr>
+            <w:tcW w:type="dxa" w:w="1152"/>
+          </w:tcPr>
+          <w:p>
+            <w:pPr>
+              <w:jc w:val="center"/>
+            </w:pPr>
+            <w:r>
+              <w:rPr>
+                <w:sz w:val="17"/>
+              </w:rPr>
+              <w:t>-0.1566</w:t>
+            </w:r>
+          </w:p>
+        </w:tc>
+        <w:tc>
+          <w:tcPr>
+            <w:tcW w:type="dxa" w:w="1152"/>
+          </w:tcPr>
+          <w:p>
+            <w:pPr>
+              <w:jc w:val="center"/>
+            </w:pPr>
+            <w:r>
+              <w:rPr>
+                <w:sz w:val="17"/>
+              </w:rPr>
+              <w:t>0.5061</w:t>
+            </w:r>
+          </w:p>
+        </w:tc>
+        <w:tc>
+          <w:tcPr>
+            <w:tcW w:type="dxa" w:w="1440"/>
+          </w:tcPr>
+          <w:p>
+            <w:pPr>
+              <w:jc w:val="center"/>
+            </w:pPr>
+            <w:r>
+              <w:rPr>
+                <w:sz w:val="17"/>
+              </w:rPr>
+              <w:t>+0.6061</w:t>
+            </w:r>
+          </w:p>
+        </w:tc>
+        <w:tc>
+          <w:tcPr>
+            <w:tcW w:type="dxa" w:w="1296"/>
+          </w:tcPr>
+          <w:p>
+            <w:pPr>
+              <w:jc w:val="center"/>
+            </w:pPr>
+            <w:r>
+              <w:rPr>
+                <w:sz w:val="17"/>
+              </w:rPr>
+              <w:t>91.1%</w:t>
+            </w:r>
+          </w:p>
+        </w:tc>
+        <w:tc>
+          <w:tcPr>
+            <w:tcW w:type="dxa" w:w="1584"/>
+          </w:tcPr>
+          <w:p>
+            <w:pPr>
+              <w:jc w:val="center"/>
+            </w:pPr>
+            <w:r>
+              <w:rPr>
+                <w:sz w:val="17"/>
+              </w:rPr>
+              <w:t>0.156→0.783</w:t>
+            </w:r>
+          </w:p>
+        </w:tc>
+        <w:tc>
+          <w:tcPr>
+            <w:tcW w:type="dxa" w:w="1584"/>
+          </w:tcPr>
+          <w:p>
+            <w:pPr>
+              <w:jc w:val="center"/>
+            </w:pPr>
+            <w:r>
+              <w:rPr>
+                <w:sz w:val="17"/>
+              </w:rPr>
+              <w:t>0.579→0.778</w:t>
+            </w:r>
+          </w:p>
+        </w:tc>
+      </w:tr>
+      <w:tr>
+        <w:tc>
+          <w:tcPr>
+            <w:tcW w:type="dxa" w:w="864"/>
+          </w:tcPr>
+          <w:p>
+            <w:pPr>
+              <w:jc w:val="center"/>
+            </w:pPr>
+            <w:r>
+              <w:rPr>
+                <w:sz w:val="17"/>
+              </w:rPr>
+              <w:t>2</w:t>
+            </w:r>
+          </w:p>
+        </w:tc>
+        <w:tc>
+          <w:tcPr>
+            <w:tcW w:type="dxa" w:w="1152"/>
+          </w:tcPr>
+          <w:p>
+            <w:pPr>
+              <w:jc w:val="center"/>
+            </w:pPr>
+            <w:r>
+              <w:rPr>
+                <w:sz w:val="17"/>
+              </w:rPr>
+              <w:t>-0.0673</w:t>
+            </w:r>
+          </w:p>
+        </w:tc>
+        <w:tc>
+          <w:tcPr>
+            <w:tcW w:type="dxa" w:w="1152"/>
+          </w:tcPr>
+          <w:p>
+            <w:pPr>
+              <w:jc w:val="center"/>
+            </w:pPr>
+            <w:r>
+              <w:rPr>
+                <w:sz w:val="17"/>
+              </w:rPr>
+              <w:t>0.5559</w:t>
+            </w:r>
+          </w:p>
+        </w:tc>
+        <w:tc>
+          <w:tcPr>
+            <w:tcW w:type="dxa" w:w="1440"/>
+          </w:tcPr>
+          <w:p>
+            <w:pPr>
+              <w:jc w:val="center"/>
+            </w:pPr>
+            <w:r>
+              <w:rPr>
+                <w:sz w:val="17"/>
+              </w:rPr>
+              <w:t>+0.5703</w:t>
+            </w:r>
+          </w:p>
+        </w:tc>
+        <w:tc>
+          <w:tcPr>
+            <w:tcW w:type="dxa" w:w="1296"/>
+          </w:tcPr>
+          <w:p>
+            <w:pPr>
+              <w:jc w:val="center"/>
+            </w:pPr>
+            <w:r>
+              <w:rPr>
+                <w:sz w:val="17"/>
+              </w:rPr>
+              <w:t>85.8%</w:t>
+            </w:r>
+          </w:p>
+        </w:tc>
+        <w:tc>
+          <w:tcPr>
+            <w:tcW w:type="dxa" w:w="1584"/>
+          </w:tcPr>
+          <w:p>
+            <w:pPr>
+              <w:jc w:val="center"/>
+            </w:pPr>
+            <w:r>
+              <w:rPr>
+                <w:sz w:val="17"/>
+              </w:rPr>
+              <w:t>0.269→0.877</w:t>
+            </w:r>
+          </w:p>
+        </w:tc>
+        <w:tc>
+          <w:tcPr>
+            <w:tcW w:type="dxa" w:w="1584"/>
+          </w:tcPr>
+          <w:p>
+            <w:pPr>
+              <w:jc w:val="center"/>
+            </w:pPr>
+            <w:r>
+              <w:rPr>
+                <w:sz w:val="17"/>
+              </w:rPr>
+              <w:t>0.660→0.782</w:t>
+            </w:r>
+          </w:p>
+        </w:tc>
+      </w:tr>
+      <w:tr>
+        <w:tc>
+          <w:tcPr>
+            <w:tcW w:type="dxa" w:w="864"/>
+          </w:tcPr>
+          <w:p>
+            <w:pPr>
+              <w:jc w:val="center"/>
+            </w:pPr>
+            <w:r>
+              <w:rPr>
+                <w:sz w:val="17"/>
+              </w:rPr>
+              <w:t>3</w:t>
+            </w:r>
+          </w:p>
+        </w:tc>
+        <w:tc>
+          <w:tcPr>
+            <w:tcW w:type="dxa" w:w="1152"/>
+          </w:tcPr>
+          <w:p>
+            <w:pPr>
+              <w:jc w:val="center"/>
+            </w:pPr>
+            <w:r>
+              <w:rPr>
+                <w:sz w:val="17"/>
+              </w:rPr>
+              <w:t>-0.1557</w:t>
+            </w:r>
+          </w:p>
+        </w:tc>
+        <w:tc>
+          <w:tcPr>
+            <w:tcW w:type="dxa" w:w="1152"/>
+          </w:tcPr>
+          <w:p>
+            <w:pPr>
+              <w:jc w:val="center"/>
+            </w:pPr>
+            <w:r>
+              <w:rPr>
+                <w:sz w:val="17"/>
+              </w:rPr>
+              <w:t>0.5169</w:t>
+            </w:r>
+          </w:p>
+        </w:tc>
+        <w:tc>
+          <w:tcPr>
+            <w:tcW w:type="dxa" w:w="1440"/>
+          </w:tcPr>
+          <w:p>
+            <w:pPr>
+              <w:jc w:val="center"/>
+            </w:pPr>
+            <w:r>
+              <w:rPr>
+                <w:sz w:val="17"/>
+              </w:rPr>
+              <w:t>+0.6617</w:t>
+            </w:r>
+          </w:p>
+        </w:tc>
+        <w:tc>
+          <w:tcPr>
+            <w:tcW w:type="dxa" w:w="1296"/>
+          </w:tcPr>
+          <w:p>
+            <w:pPr>
+              <w:jc w:val="center"/>
+            </w:pPr>
+            <w:r>
+              <w:rPr>
+                <w:sz w:val="17"/>
+              </w:rPr>
+              <w:t>94.7%</w:t>
+            </w:r>
+          </w:p>
+        </w:tc>
+        <w:tc>
+          <w:tcPr>
+            <w:tcW w:type="dxa" w:w="1584"/>
+          </w:tcPr>
+          <w:p>
+            <w:pPr>
+              <w:jc w:val="center"/>
+            </w:pPr>
+            <w:r>
+              <w:rPr>
+                <w:sz w:val="17"/>
+              </w:rPr>
+              <w:t>0.136→0.820</w:t>
+            </w:r>
+          </w:p>
+        </w:tc>
+        <w:tc>
+          <w:tcPr>
+            <w:tcW w:type="dxa" w:w="1584"/>
+          </w:tcPr>
+          <w:p>
+            <w:pPr>
+              <w:jc w:val="center"/>
+            </w:pPr>
+            <w:r>
+              <w:rPr>
+                <w:sz w:val="17"/>
+              </w:rPr>
+              <w:t>0.535→0.780</w:t>
+            </w:r>
+          </w:p>
+        </w:tc>
+      </w:tr>
+      <w:tr>
+        <w:tc>
+          <w:tcPr>
+            <w:tcW w:type="dxa" w:w="864"/>
+          </w:tcPr>
+          <w:p>
+            <w:pPr>
+              <w:jc w:val="center"/>
+            </w:pPr>
+            <w:r>
+              <w:rPr>
+                <w:sz w:val="17"/>
+              </w:rPr>
+              <w:t>4</w:t>
+            </w:r>
+          </w:p>
+        </w:tc>
+        <w:tc>
+          <w:tcPr>
+            <w:tcW w:type="dxa" w:w="1152"/>
+          </w:tcPr>
+          <w:p>
+            <w:pPr>
+              <w:jc w:val="center"/>
+            </w:pPr>
+            <w:r>
+              <w:rPr>
+                <w:sz w:val="17"/>
+              </w:rPr>
+              <w:t>-0.1466</w:t>
+            </w:r>
+          </w:p>
+        </w:tc>
+        <w:tc>
+          <w:tcPr>
+            <w:tcW w:type="dxa" w:w="1152"/>
+          </w:tcPr>
+          <w:p>
+            <w:pPr>
+              <w:jc w:val="center"/>
+            </w:pPr>
+            <w:r>
+              <w:rPr>
+                <w:sz w:val="17"/>
+              </w:rPr>
+              <w:t>0.4682</w:t>
+            </w:r>
+          </w:p>
+        </w:tc>
+        <w:tc>
+          <w:tcPr>
+            <w:tcW w:type="dxa" w:w="1440"/>
+          </w:tcPr>
+          <w:p>
+            <w:pPr>
+              <w:jc w:val="center"/>
+            </w:pPr>
+            <w:r>
+              <w:rPr>
+                <w:sz w:val="17"/>
+              </w:rPr>
+              <w:t>+0.5808</w:t>
+            </w:r>
+          </w:p>
+        </w:tc>
+        <w:tc>
+          <w:tcPr>
+            <w:tcW w:type="dxa" w:w="1296"/>
+          </w:tcPr>
+          <w:p>
+            <w:pPr>
+              <w:jc w:val="center"/>
+            </w:pPr>
+            <w:r>
+              <w:rPr>
+                <w:sz w:val="17"/>
+              </w:rPr>
+              <w:t>92.9%</w:t>
+            </w:r>
+          </w:p>
+        </w:tc>
+        <w:tc>
+          <w:tcPr>
+            <w:tcW w:type="dxa" w:w="1584"/>
+          </w:tcPr>
+          <w:p>
+            <w:pPr>
+              <w:jc w:val="center"/>
+            </w:pPr>
+            <w:r>
+              <w:rPr>
+                <w:sz w:val="17"/>
+              </w:rPr>
+              <w:t>0.156→0.736</w:t>
+            </w:r>
+          </w:p>
+        </w:tc>
+        <w:tc>
+          <w:tcPr>
+            <w:tcW w:type="dxa" w:w="1584"/>
+          </w:tcPr>
+          <w:p>
+            <w:pPr>
+              <w:jc w:val="center"/>
+            </w:pPr>
+            <w:r>
+              <w:rPr>
+                <w:sz w:val="17"/>
+              </w:rPr>
+              <w:t>0.592→0.779</w:t>
+            </w:r>
+          </w:p>
+        </w:tc>
+      </w:tr>
+      <w:tr>
+        <w:tc>
+          <w:tcPr>
+            <w:tcW w:type="dxa" w:w="864"/>
+          </w:tcPr>
+          <w:p>
+            <w:pPr>
+              <w:jc w:val="center"/>
+            </w:pPr>
+            <w:r>
+              <w:rPr>
+                <w:sz w:val="17"/>
+              </w:rPr>
+              <w:t>均值</w:t>
+            </w:r>
+          </w:p>
+        </w:tc>
+        <w:tc>
+          <w:tcPr>
+            <w:tcW w:type="dxa" w:w="1152"/>
+          </w:tcPr>
+          <w:p>
+            <w:pPr>
+              <w:jc w:val="center"/>
+            </w:pPr>
+            <w:r>
+              <w:rPr>
+                <w:sz w:val="17"/>
+              </w:rPr>
+              <w:t>-0.1314</w:t>
+            </w:r>
+          </w:p>
+        </w:tc>
+        <w:tc>
+          <w:tcPr>
+            <w:tcW w:type="dxa" w:w="1152"/>
+          </w:tcPr>
+          <w:p>
+            <w:pPr>
+              <w:jc w:val="center"/>
+            </w:pPr>
+            <w:r>
+              <w:rPr>
+                <w:sz w:val="17"/>
+              </w:rPr>
+              <w:t>0.5051</w:t>
+            </w:r>
+          </w:p>
+        </w:tc>
+        <w:tc>
+          <w:tcPr>
+            <w:tcW w:type="dxa" w:w="1440"/>
+          </w:tcPr>
+          <w:p>
+            <w:pPr>
+              <w:jc w:val="center"/>
+            </w:pPr>
+            <w:r>
+              <w:rPr>
+                <w:sz w:val="17"/>
+              </w:rPr>
+              <w:t>+0.6113</w:t>
+            </w:r>
+          </w:p>
+        </w:tc>
+        <w:tc>
+          <w:tcPr>
+            <w:tcW w:type="dxa" w:w="1296"/>
+          </w:tcPr>
+          <w:p>
+            <w:pPr>
+              <w:jc w:val="center"/>
+            </w:pPr>
+            <w:r>
+              <w:rPr>
+                <w:sz w:val="17"/>
+              </w:rPr>
+              <w:t>92.3%</w:t>
+            </w:r>
+          </w:p>
+        </w:tc>
+        <w:tc>
+          <w:tcPr>
+            <w:tcW w:type="dxa" w:w="1584"/>
+          </w:tcPr>
+          <w:p>
+            <w:pPr>
+              <w:jc w:val="center"/>
+            </w:pPr>
+            <w:r>
+              <w:rPr>
+                <w:sz w:val="17"/>
+              </w:rPr>
+              <w:t>0.175→0.802</w:t>
+            </w:r>
+          </w:p>
+        </w:tc>
+        <w:tc>
+          <w:tcPr>
+            <w:tcW w:type="dxa" w:w="1584"/>
+          </w:tcPr>
+          <w:p>
+            <w:pPr>
+              <w:jc w:val="center"/>
+            </w:pPr>
+            <w:r>
+              <w:rPr>
+                <w:sz w:val="17"/>
+              </w:rPr>
+              <w:t>0.596→0.780</w:t>
+            </w:r>
+          </w:p>
+        </w:tc>
+      </w:tr>
+    </w:tbl>
+    <w:p/>
+    <w:p>
+      <w:r>
+        <w:rPr>
+          <w:b/>
+        </w:rPr>
+        <w:t>日聚合监督在非洲原位有效，且幅度很大：配对 ΔKGE +0.611（标准差 0.038），92.3% 的流域改善，M1 中位 KGE +0.505——超过专为大洲留出训练的 PUB 基线（+0.279），而所用模型从未见过任何非洲流域，仅靠日观测适配。</w:t>
+      </w:r>
+    </w:p>
+    <w:p>
+      <w:r>
+        <w:t>α 是主机制且未过冲：0.175 → 0.802，五折全部落在 0.736–0.877，无一越过 1。零样本时模型只复现观测变幅的 17%，微调后到 80%。对比全球实验中有 6.25% 的站被推过 α = 1.2 变成过离散——非洲的修正空间太大，过冲根本不会发生。</w:t>
+      </w:r>
+    </w:p>
+    <w:p>
+      <w:pPr>
+        <w:pStyle w:val="Heading2"/>
+      </w:pPr>
+      <w:r>
+        <w:t>3.6 这为“时相不受影响”划出了边界</w:t>
+      </w:r>
+    </w:p>
+    <w:p>
+      <w:r>
+        <w:t>本报告其余各处 r 几乎不动：跨两条数据路径、两套划分与三档回放，中位 Δr 都在 −0.006 至 +0.008 之间。而非洲原位微调中 r 从 0.596 升到 0.780，且 M1 的 r 折间标准差仅 0.0016（0.7777–0.7822）——五次独立微调收敛到同一数值，不可能是偶然。</w:t>
+      </w:r>
+    </w:p>
+    <w:p>
+      <w:r>
+        <w:rPr>
+          <w:b/>
+        </w:rPr>
+        <w:t>因此此前的结论需要加上适用范围而非撤回：日聚合监督在模型已掌握该区域动力学时不改变时相，在未掌握时能够改善时相。</w:t>
+      </w:r>
+    </w:p>
+    <w:p>
+      <w:r>
+        <w:t>非洲零样本的 r 只有 0.60——时相本就没有学到——而非洲的日观测携带了足以修正它的信息。只有真正外部的域才能暴露这条边界；温带目标站永远做不到，因为它们的时相本来就是对的。</w:t>
       </w:r>
     </w:p>
     <w:p>
@@ -7668,6 +8531,375 @@
     </w:p>
     <w:p>
       <w:pPr>
+        <w:pStyle w:val="Heading2"/>
+      </w:pPr>
+      <w:r>
+        <w:t>4.7 空间分块的机理分解</w:t>
+      </w:r>
+    </w:p>
+    <w:p>
+      <w:r>
+        <w:rPr>
+          <w:b/>
+          <w:sz w:val="18"/>
+        </w:rPr>
+        <w:t>表 4-8　空间分块划分下的 KGE 分解（全小时配对，8,862 站）</w:t>
+      </w:r>
+    </w:p>
+    <w:tbl>
+      <w:tblPr>
+        <w:tblStyle w:val="LightGrid-Accent1"/>
+        <w:tblW w:type="auto" w:w="0"/>
+        <w:jc w:val="center"/>
+        <w:tblLook w:firstColumn="1" w:firstRow="1" w:lastColumn="0" w:lastRow="0" w:noHBand="0" w:noVBand="1" w:val="04A0"/>
+      </w:tblPr>
+      <w:tblGrid>
+        <w:gridCol w:w="2160"/>
+        <w:gridCol w:w="2160"/>
+        <w:gridCol w:w="2160"/>
+        <w:gridCol w:w="2160"/>
+      </w:tblGrid>
+      <w:tr>
+        <w:tc>
+          <w:tcPr>
+            <w:tcW w:type="dxa" w:w="2016"/>
+          </w:tcPr>
+          <w:p>
+            <w:r>
+              <w:rPr>
+                <w:b/>
+                <w:sz w:val="17"/>
+              </w:rPr>
+              <w:t>分量</w:t>
+            </w:r>
+          </w:p>
+        </w:tc>
+        <w:tc>
+          <w:tcPr>
+            <w:tcW w:type="dxa" w:w="1440"/>
+          </w:tcPr>
+          <w:p>
+            <w:r>
+              <w:rPr>
+                <w:b/>
+                <w:sz w:val="17"/>
+              </w:rPr>
+              <w:t>M0</w:t>
+            </w:r>
+          </w:p>
+        </w:tc>
+        <w:tc>
+          <w:tcPr>
+            <w:tcW w:type="dxa" w:w="1440"/>
+          </w:tcPr>
+          <w:p>
+            <w:r>
+              <w:rPr>
+                <w:b/>
+                <w:sz w:val="17"/>
+              </w:rPr>
+              <w:t>M1</w:t>
+            </w:r>
+          </w:p>
+        </w:tc>
+        <w:tc>
+          <w:tcPr>
+            <w:tcW w:type="dxa" w:w="1440"/>
+          </w:tcPr>
+          <w:p>
+            <w:r>
+              <w:rPr>
+                <w:b/>
+                <w:sz w:val="17"/>
+              </w:rPr>
+              <w:t>Δ</w:t>
+            </w:r>
+          </w:p>
+        </w:tc>
+      </w:tr>
+      <w:tr>
+        <w:tc>
+          <w:tcPr>
+            <w:tcW w:type="dxa" w:w="2016"/>
+          </w:tcPr>
+          <w:p>
+            <w:pPr>
+              <w:jc w:val="center"/>
+            </w:pPr>
+            <w:r>
+              <w:rPr>
+                <w:sz w:val="17"/>
+              </w:rPr>
+              <w:t>KGE</w:t>
+            </w:r>
+          </w:p>
+        </w:tc>
+        <w:tc>
+          <w:tcPr>
+            <w:tcW w:type="dxa" w:w="1440"/>
+          </w:tcPr>
+          <w:p>
+            <w:pPr>
+              <w:jc w:val="center"/>
+            </w:pPr>
+            <w:r>
+              <w:rPr>
+                <w:sz w:val="17"/>
+              </w:rPr>
+              <w:t>0.4014</w:t>
+            </w:r>
+          </w:p>
+        </w:tc>
+        <w:tc>
+          <w:tcPr>
+            <w:tcW w:type="dxa" w:w="1440"/>
+          </w:tcPr>
+          <w:p>
+            <w:pPr>
+              <w:jc w:val="center"/>
+            </w:pPr>
+            <w:r>
+              <w:rPr>
+                <w:sz w:val="17"/>
+              </w:rPr>
+              <w:t>0.4775</w:t>
+            </w:r>
+          </w:p>
+        </w:tc>
+        <w:tc>
+          <w:tcPr>
+            <w:tcW w:type="dxa" w:w="1440"/>
+          </w:tcPr>
+          <w:p>
+            <w:pPr>
+              <w:jc w:val="center"/>
+            </w:pPr>
+            <w:r>
+              <w:rPr>
+                <w:sz w:val="17"/>
+              </w:rPr>
+              <w:t>+0.0473</w:t>
+            </w:r>
+          </w:p>
+        </w:tc>
+      </w:tr>
+      <w:tr>
+        <w:tc>
+          <w:tcPr>
+            <w:tcW w:type="dxa" w:w="2016"/>
+          </w:tcPr>
+          <w:p>
+            <w:pPr>
+              <w:jc w:val="center"/>
+            </w:pPr>
+            <w:r>
+              <w:rPr>
+                <w:sz w:val="17"/>
+              </w:rPr>
+              <w:t>r（时相）</w:t>
+            </w:r>
+          </w:p>
+        </w:tc>
+        <w:tc>
+          <w:tcPr>
+            <w:tcW w:type="dxa" w:w="1440"/>
+          </w:tcPr>
+          <w:p>
+            <w:pPr>
+              <w:jc w:val="center"/>
+            </w:pPr>
+            <w:r>
+              <w:rPr>
+                <w:sz w:val="17"/>
+              </w:rPr>
+              <w:t>0.7589</w:t>
+            </w:r>
+          </w:p>
+        </w:tc>
+        <w:tc>
+          <w:tcPr>
+            <w:tcW w:type="dxa" w:w="1440"/>
+          </w:tcPr>
+          <w:p>
+            <w:pPr>
+              <w:jc w:val="center"/>
+            </w:pPr>
+            <w:r>
+              <w:rPr>
+                <w:sz w:val="17"/>
+              </w:rPr>
+              <w:t>0.7864</w:t>
+            </w:r>
+          </w:p>
+        </w:tc>
+        <w:tc>
+          <w:tcPr>
+            <w:tcW w:type="dxa" w:w="1440"/>
+          </w:tcPr>
+          <w:p>
+            <w:pPr>
+              <w:jc w:val="center"/>
+            </w:pPr>
+            <w:r>
+              <w:rPr>
+                <w:sz w:val="17"/>
+              </w:rPr>
+              <w:t>+0.0139</w:t>
+            </w:r>
+          </w:p>
+        </w:tc>
+      </w:tr>
+      <w:tr>
+        <w:tc>
+          <w:tcPr>
+            <w:tcW w:type="dxa" w:w="2016"/>
+          </w:tcPr>
+          <w:p>
+            <w:pPr>
+              <w:jc w:val="center"/>
+            </w:pPr>
+            <w:r>
+              <w:rPr>
+                <w:sz w:val="17"/>
+              </w:rPr>
+              <w:t>α（方差）</w:t>
+            </w:r>
+          </w:p>
+        </w:tc>
+        <w:tc>
+          <w:tcPr>
+            <w:tcW w:type="dxa" w:w="1440"/>
+          </w:tcPr>
+          <w:p>
+            <w:pPr>
+              <w:jc w:val="center"/>
+            </w:pPr>
+            <w:r>
+              <w:rPr>
+                <w:sz w:val="17"/>
+              </w:rPr>
+              <w:t>0.8519</w:t>
+            </w:r>
+          </w:p>
+        </w:tc>
+        <w:tc>
+          <w:tcPr>
+            <w:tcW w:type="dxa" w:w="1440"/>
+          </w:tcPr>
+          <w:p>
+            <w:pPr>
+              <w:jc w:val="center"/>
+            </w:pPr>
+            <w:r>
+              <w:rPr>
+                <w:sz w:val="17"/>
+              </w:rPr>
+              <w:t>0.9493</w:t>
+            </w:r>
+          </w:p>
+        </w:tc>
+        <w:tc>
+          <w:tcPr>
+            <w:tcW w:type="dxa" w:w="1440"/>
+          </w:tcPr>
+          <w:p>
+            <w:pPr>
+              <w:jc w:val="center"/>
+            </w:pPr>
+            <w:r>
+              <w:rPr>
+                <w:sz w:val="17"/>
+              </w:rPr>
+              <w:t>+0.0909</w:t>
+            </w:r>
+          </w:p>
+        </w:tc>
+      </w:tr>
+      <w:tr>
+        <w:tc>
+          <w:tcPr>
+            <w:tcW w:type="dxa" w:w="2016"/>
+          </w:tcPr>
+          <w:p>
+            <w:pPr>
+              <w:jc w:val="center"/>
+            </w:pPr>
+            <w:r>
+              <w:rPr>
+                <w:sz w:val="17"/>
+              </w:rPr>
+              <w:t>β（偏差）</w:t>
+            </w:r>
+          </w:p>
+        </w:tc>
+        <w:tc>
+          <w:tcPr>
+            <w:tcW w:type="dxa" w:w="1440"/>
+          </w:tcPr>
+          <w:p>
+            <w:pPr>
+              <w:jc w:val="center"/>
+            </w:pPr>
+            <w:r>
+              <w:rPr>
+                <w:sz w:val="17"/>
+              </w:rPr>
+              <w:t>1.0325</w:t>
+            </w:r>
+          </w:p>
+        </w:tc>
+        <w:tc>
+          <w:tcPr>
+            <w:tcW w:type="dxa" w:w="1440"/>
+          </w:tcPr>
+          <w:p>
+            <w:pPr>
+              <w:jc w:val="center"/>
+            </w:pPr>
+            <w:r>
+              <w:rPr>
+                <w:sz w:val="17"/>
+              </w:rPr>
+              <w:t>0.8829</w:t>
+            </w:r>
+          </w:p>
+        </w:tc>
+        <w:tc>
+          <w:tcPr>
+            <w:tcW w:type="dxa" w:w="1440"/>
+          </w:tcPr>
+          <w:p>
+            <w:pPr>
+              <w:jc w:val="center"/>
+            </w:pPr>
+            <w:r>
+              <w:rPr>
+                <w:sz w:val="17"/>
+              </w:rPr>
+              <w:t>-0.1413</w:t>
+            </w:r>
+          </w:p>
+        </w:tc>
+      </w:tr>
+    </w:tbl>
+    <w:p/>
+    <w:p>
+      <w:r>
+        <w:t>变差站中的元凶占比：r 4.2%、α 23.1%、β 72.7%。时相的牵连甚至比随机划分（7.7%）更小，因此“监督只重标定、不扰动时相”这一结论在更难的划分下同样成立。</w:t>
+      </w:r>
+    </w:p>
+    <w:p>
+      <w:r>
+        <w:t>日内形状与随机划分同型，且不存在退化解：观测 flashiness 0.0285，M0 0.1697（过量 5.9 倍），M1 0.0747；均值观测 0.0483 对 M0 0.0280（不足一半）与 M1 0.0486（1.01 倍）。微调修好水量并把过量抖动减半。</w:t>
+      </w:r>
+    </w:p>
+    <w:p>
+      <w:r>
+        <w:t>显著性：BH 校正后 8,276/8,862（93.4%）变化显著，但方向同样分裂——42.7% 改善、50.7% 变差，池化 ΔKGE +0.0421（p = 4.4e-42）。§6.3 的“标定而非精度”这一保留在此同样适用。</w:t>
+      </w:r>
+    </w:p>
+    <w:p>
+      <w:pPr>
         <w:pStyle w:val="Heading1"/>
       </w:pPr>
       <w:r>
@@ -7719,7 +8951,15 @@
         <w:pStyle w:val="ListNumber"/>
       </w:pPr>
       <w:r>
-        <w:t>六、源域回放能同时改善两个域。0.25 一档在目标域（+0.0449→+0.0643）与源域（−0.1064→−0.0668）上均优于无回放，五折两指标全部同向；机制是阻尼过度重标定，把过冲站从 6.25% 压到 2.09%。</w:t>
+        <w:t>六、方法在非洲原位有效，且超过专门训练的基线。在非洲自己的日观测上微调，五折配对 ΔKGE +0.611、92.3% 的流域改善、M1 中位 KGE +0.505，高于大洲留出 PUB 基线的 +0.279。同时这划出了第一条结论的边界：非洲原位微调使 r 从 0.596 升到 0.780（M1 折间标准差仅 0.0016），说明“不改变时相”只在模型已掌握该域动力学时成立。</w:t>
+      </w:r>
+    </w:p>
+    <w:p>
+      <w:pPr>
+        <w:pStyle w:val="ListNumber"/>
+      </w:pPr>
+      <w:r>
+        <w:t>七、源域回放能同时改善两个域。0.25 一档在目标域（+0.0449→+0.0643）与源域（−0.1064→−0.0668）上均优于无回放，五折两指标全部同向；机制是阻尼过度重标定，把过冲站从 6.25% 压到 2.09%。</w:t>
       </w:r>
     </w:p>
     <w:p>
@@ -7831,7 +9071,7 @@
         <w:rPr>
           <w:b/>
         </w:rPr>
-        <w:t>应对：建议补做。代价为一次迁移训练（约 1 小时，复用已有预训练权重），不需重新预训练。在补做之前，现有非洲结果应表述为“温带微调模型的跨大洲外推”，而非“Phase I 方法在非洲的验证”。</w:t>
+        <w:t>应对：已补做，见 §3.5–3.6。五折原位微调给出配对 ΔKGE +0.611、92.3% 流域改善，并超过 PUB 基线。原有的温带迁移结果仍然有效，但表述为“跨大洲外推测试”，而非“方法在非洲的验证”——后者现在由 §3.5 承担。</w:t>
       </w:r>
     </w:p>
     <w:p>

</xml_diff>

<commit_message>
Latinise the CJK font names the docx template carries
python-docx's default theme ships East-Asian font fallback entries written in their own
scripts -- SimSun, PMingLiU, MS Mincho, MS Gothic, Malgun Gothic -- inside
word/fontTable.xml and word/theme/theme1.xml. They are invisible to a reader, but they mean
a document meant to be entirely English is not, which matters when the audience does not
read those scripts. Each is replaced with the same font's Latin name, so Word resolves it
identically.

Done as a post-save step in build_report.py rather than by hand, since a manual edit would
be undone by the next regeneration. It also verifies afterwards and fails loudly if any
non-ASCII survives: the first pass missed MS Gothic because the search had looked only for
Han ideographs and not katakana, and a mapping that silently misses an entry is worse than
no mapping.

Co-Authored-By: Claude Opus 5 <noreply@anthropic.com>
</commit_message>
<xml_diff>
--- a/reports/PhaseI_report.docx
+++ b/reports/PhaseI_report.docx
@@ -38920,10 +38920,10 @@
         <a:latin typeface="Calibri"/>
         <a:ea typeface=""/>
         <a:cs typeface=""/>
-        <a:font script="Jpan" typeface="ＭＳ ゴシック"/>
-        <a:font script="Hang" typeface="맑은 고딕"/>
-        <a:font script="Hans" typeface="宋体"/>
-        <a:font script="Hant" typeface="新細明體"/>
+        <a:font script="Jpan" typeface="MS Gothic"/>
+        <a:font script="Hang" typeface="Malgun Gothic"/>
+        <a:font script="Hans" typeface="SimSun"/>
+        <a:font script="Hant" typeface="PMingLiU"/>
         <a:font script="Arab" typeface="Times New Roman"/>
         <a:font script="Hebr" typeface="Times New Roman"/>
         <a:font script="Thai" typeface="Angsana New"/>
@@ -38955,10 +38955,10 @@
         <a:latin typeface="Cambria"/>
         <a:ea typeface=""/>
         <a:cs typeface=""/>
-        <a:font script="Jpan" typeface="ＭＳ 明朝"/>
-        <a:font script="Hang" typeface="맑은 고딕"/>
-        <a:font script="Hans" typeface="宋体"/>
-        <a:font script="Hant" typeface="新細明體"/>
+        <a:font script="Jpan" typeface="MS Mincho"/>
+        <a:font script="Hang" typeface="Malgun Gothic"/>
+        <a:font script="Hans" typeface="SimSun"/>
+        <a:font script="Hant" typeface="PMingLiU"/>
         <a:font script="Arab" typeface="Arial"/>
         <a:font script="Hebr" typeface="Arial"/>
         <a:font script="Thai" typeface="Cordia New"/>

</xml_diff>

<commit_message>
Say which configuration each figure shows
Asked whether the figures all carry the forget-gate initialisation, and tracing it fold by
fold gave a clean answer -- six show v2 exclusively, one shows v2 and v3, and two contrast
v1 against v2 on purpose, so no figure presents v1 as the headline result. But five of them
did not SAY so anywhere on the figure, and v1 versus v2 is exactly the distinction several
of them exist to make. A reader could not tell a v2 panel from a v1 one.

Adds a stamp() helper that prints the configuration under the axes -- hourly look-back 336 h,
forget-gate initialisation 3, and that the gate is part of Gauch et al.'s published method
and absent from v1 -- and applies it to the five that lacked it, merging with their existing
footnotes rather than replacing them. The three that already name v1/v2/v3 inside the plot
keep doing that, and the global map's report caption now names v2 too.

Co-Authored-By: Claude Opus 5 <noreply@anthropic.com>
</commit_message>
<xml_diff>
--- a/reports/PhaseI_report.docx
+++ b/reports/PhaseI_report.docx
@@ -4761,7 +4761,7 @@
       <w:r>
         <w:drawing>
           <wp:inline xmlns:a="http://schemas.openxmlformats.org/drawingml/2006/main" xmlns:pic="http://schemas.openxmlformats.org/drawingml/2006/picture">
-            <wp:extent cx="5852160" cy="2530855"/>
+            <wp:extent cx="5852160" cy="2626247"/>
             <wp:docPr id="2" name="Picture 2"/>
             <wp:cNvGraphicFramePr>
               <a:graphicFrameLocks noChangeAspect="1"/>
@@ -4782,7 +4782,7 @@
                   <pic:spPr>
                     <a:xfrm>
                       <a:off x="0" y="0"/>
-                      <a:ext cx="5852160" cy="2530855"/>
+                      <a:ext cx="5852160" cy="2626247"/>
                     </a:xfrm>
                     <a:prstGeom prst="rect"/>
                   </pic:spPr>
@@ -9556,7 +9556,7 @@
       <w:r>
         <w:drawing>
           <wp:inline xmlns:a="http://schemas.openxmlformats.org/drawingml/2006/main" xmlns:pic="http://schemas.openxmlformats.org/drawingml/2006/picture">
-            <wp:extent cx="5852160" cy="2427735"/>
+            <wp:extent cx="5852160" cy="2554847"/>
             <wp:docPr id="4" name="Picture 4"/>
             <wp:cNvGraphicFramePr>
               <a:graphicFrameLocks noChangeAspect="1"/>
@@ -9577,7 +9577,7 @@
                   <pic:spPr>
                     <a:xfrm>
                       <a:off x="0" y="0"/>
-                      <a:ext cx="5852160" cy="2427735"/>
+                      <a:ext cx="5852160" cy="2554847"/>
                     </a:xfrm>
                     <a:prstGeom prst="rect"/>
                   </pic:spPr>
@@ -10601,7 +10601,7 @@
       <w:r>
         <w:drawing>
           <wp:inline xmlns:a="http://schemas.openxmlformats.org/drawingml/2006/main" xmlns:pic="http://schemas.openxmlformats.org/drawingml/2006/picture">
-            <wp:extent cx="5852160" cy="4011913"/>
+            <wp:extent cx="5852160" cy="5209917"/>
             <wp:docPr id="6" name="Picture 6"/>
             <wp:cNvGraphicFramePr>
               <a:graphicFrameLocks noChangeAspect="1"/>
@@ -10622,7 +10622,7 @@
                   <pic:spPr>
                     <a:xfrm>
                       <a:off x="0" y="0"/>
-                      <a:ext cx="5852160" cy="4011913"/>
+                      <a:ext cx="5852160" cy="5209917"/>
                     </a:xfrm>
                     <a:prstGeom prst="rect"/>
                   </pic:spPr>
@@ -10699,7 +10699,7 @@
         <w:rPr>
           <w:sz w:val="18"/>
         </w:rPr>
-        <w:t>Figure 4-4  Target-domain hourly metrics in space. Top left, zero-shot M0 KGE; top right, M1 after fine-tuning; bottom left, the gain M1 − M0 on a diverging scale centred at zero; bottom right, α at M0 centred at 1.0. The 5-fold design makes every gauge a target gauge exactly once, so every marker is a real value.</w:t>
+        <w:t>Figure 4-4  Target-domain hourly metrics in space, configuration v2. Top left, zero-shot M0 KGE; top right, M1 after fine-tuning; bottom left, the gain M1 − M0 on a diverging scale centred at zero; bottom right, α at M0 centred at 1.0. The 5-fold design makes every gauge a target gauge exactly once, so every marker is a real value.</w:t>
       </w:r>
     </w:p>
     <w:p>
@@ -12414,7 +12414,7 @@
       <w:r>
         <w:drawing>
           <wp:inline xmlns:a="http://schemas.openxmlformats.org/drawingml/2006/main" xmlns:pic="http://schemas.openxmlformats.org/drawingml/2006/picture">
-            <wp:extent cx="5852160" cy="2225002"/>
+            <wp:extent cx="5852160" cy="2399527"/>
             <wp:docPr id="8" name="Picture 8"/>
             <wp:cNvGraphicFramePr>
               <a:graphicFrameLocks noChangeAspect="1"/>
@@ -12435,7 +12435,7 @@
                   <pic:spPr>
                     <a:xfrm>
                       <a:off x="0" y="0"/>
-                      <a:ext cx="5852160" cy="2225002"/>
+                      <a:ext cx="5852160" cy="2399527"/>
                     </a:xfrm>
                     <a:prstGeom prst="rect"/>
                   </pic:spPr>

</xml_diff>

<commit_message>
Label the peak/trough ratios in fig10's average-day panel
The three numbers in the right-hand column were bare: "x1.05" beside a curve does not say
what is divided by what, and this figure carries no caption block to explain it since that
block was removed. The panel now prints "peak / trough" above them, and its title states
what the panel asks rather than only how it was built: "Average day: all 90 days aligned by
hour, each series over its own mean. Flat = no time-of-day cycle."

The colours were already in the legend -- orange M1, blue M0, green ERA5-Land -- but the
column sits at the far right and the legend at the bottom left, so nothing tied a bare
number to a series except its own colour.

Co-Authored-By: Claude Opus 5 <noreply@anthropic.com>
</commit_message>
<xml_diff>
--- a/reports/PhaseI_report.docx
+++ b/reports/PhaseI_report.docx
@@ -7476,7 +7476,7 @@
       <w:r>
         <w:drawing>
           <wp:inline xmlns:a="http://schemas.openxmlformats.org/drawingml/2006/main" xmlns:pic="http://schemas.openxmlformats.org/drawingml/2006/picture">
-            <wp:extent cx="6217920" cy="4619473"/>
+            <wp:extent cx="6217920" cy="4346293"/>
             <wp:docPr id="4" name="Picture 4"/>
             <wp:cNvGraphicFramePr>
               <a:graphicFrameLocks noChangeAspect="1"/>
@@ -7497,7 +7497,7 @@
                   <pic:spPr>
                     <a:xfrm>
                       <a:off x="0" y="0"/>
-                      <a:ext cx="6217920" cy="4619473"/>
+                      <a:ext cx="6217920" cy="4346293"/>
                     </a:xfrm>
                     <a:prstGeom prst="rect"/>
                   </pic:spPr>

</xml_diff>

<commit_message>
Fit the map window to the data instead of drawing the whole globe
Every panel drew longitude -180 to 180 and latitude -60 to 80, but there is not one gauge
west of -124 or east of 153, none between 50 and 110, and none above 66 or below -39. The
band from -180 to -130 held zero points in all twelve panels, as did 160 to 180. Roughly a
fifth of each panel's width was empty ocean, and it shrank the three clusters that do carry
data.

The window is now computed from everything that will be drawn -- gauges and African basins
together -- with a 3% horizontal and 5% vertical margin, and printed at run time: lon -133
to 162, lat -44 to 71. Computed rather than hard-coded, so a different station set re-fits
rather than silently cropping someone off the edge.

The Asian gap between 50 and 110 stays. Removing it would need a broken axis, which would
misrepresent distance for the sake of ink.

Co-Authored-By: Claude Opus 5 <noreply@anthropic.com>
</commit_message>
<xml_diff>
--- a/reports/PhaseI_report.docx
+++ b/reports/PhaseI_report.docx
@@ -11361,7 +11361,7 @@
       <w:r>
         <w:drawing>
           <wp:inline xmlns:a="http://schemas.openxmlformats.org/drawingml/2006/main" xmlns:pic="http://schemas.openxmlformats.org/drawingml/2006/picture">
-            <wp:extent cx="5943600" cy="3450886"/>
+            <wp:extent cx="5943600" cy="3452721"/>
             <wp:docPr id="9" name="Picture 9"/>
             <wp:cNvGraphicFramePr>
               <a:graphicFrameLocks noChangeAspect="1"/>
@@ -11382,7 +11382,7 @@
                   <pic:spPr>
                     <a:xfrm>
                       <a:off x="0" y="0"/>
-                      <a:ext cx="5943600" cy="3450886"/>
+                      <a:ext cx="5943600" cy="3452721"/>
                     </a:xfrm>
                     <a:prstGeom prst="rect"/>
                   </pic:spPr>

</xml_diff>

<commit_message>
Move both colorbars to the row's right edge, so no map column carries one
Columns 1 and 2 share a scale, so one bar served both, and it sat after column 2 -- where
the scale it describes ends. That left column 1 with nothing beside it while the other two
each had a bar, and the grid read as unfinished.

Both bars of a row now sit together at its right edge. All three map columns are bar-free
and identically spaced, so the twelve maps form a regular grid.

The cost is that the pair's bar is two columns away from the first panel it describes. The
alternatives were worse: duplicating it for column 1 puts the count back to twelve bars for
twelve panels, and moving it between columns 1 and 2 breaks the pair it is meant to join.
Same row, explicit label, and only two bars to choose between -- the association survives
the distance.

Co-Authored-By: Claude Opus 5 <noreply@anthropic.com>
</commit_message>
<xml_diff>
--- a/reports/PhaseI_report.docx
+++ b/reports/PhaseI_report.docx
@@ -11361,7 +11361,7 @@
       <w:r>
         <w:drawing>
           <wp:inline xmlns:a="http://schemas.openxmlformats.org/drawingml/2006/main" xmlns:pic="http://schemas.openxmlformats.org/drawingml/2006/picture">
-            <wp:extent cx="5943600" cy="3452721"/>
+            <wp:extent cx="5943600" cy="3238677"/>
             <wp:docPr id="9" name="Picture 9"/>
             <wp:cNvGraphicFramePr>
               <a:graphicFrameLocks noChangeAspect="1"/>
@@ -11382,7 +11382,7 @@
                   <pic:spPr>
                     <a:xfrm>
                       <a:off x="0" y="0"/>
-                      <a:ext cx="5943600" cy="3452721"/>
+                      <a:ext cx="5943600" cy="3238677"/>
                     </a:xfrm>
                     <a:prstGeom prst="rect"/>
                   </pic:spPr>

</xml_diff>

<commit_message>
Pull the columns in and shrink the figure to match
The gap between a column's colorbar and the next column's map was 0.042 of the figure
width, nearly an inch of white, when it only has to clear two sets of tick labels. It is
0.024 now.

The figure width comes down with it, and so does the height, which is the part that is not
obvious. set_aspect("equal") holds the data's 2.6:1 shape whatever rectangle it is given,
so narrowing the columns without shrinking the figure does not enlarge the maps -- it
letterboxes them, adding white above and below inside each axes. The first attempt did
exactly that. 18.6 x 10.8 keeps each rectangle at roughly the data aspect, so the maps fill
them.

3,055 x 1,742 px, down from 3,382 x 1,870, with the maps themselves no smaller.

Co-Authored-By: Claude Opus 5 <noreply@anthropic.com>
</commit_message>
<xml_diff>
--- a/reports/PhaseI_report.docx
+++ b/reports/PhaseI_report.docx
@@ -11361,7 +11361,7 @@
       <w:r>
         <w:drawing>
           <wp:inline xmlns:a="http://schemas.openxmlformats.org/drawingml/2006/main" xmlns:pic="http://schemas.openxmlformats.org/drawingml/2006/picture">
-            <wp:extent cx="5943600" cy="3286379"/>
+            <wp:extent cx="5943600" cy="3389117"/>
             <wp:docPr id="9" name="Picture 9"/>
             <wp:cNvGraphicFramePr>
               <a:graphicFrameLocks noChangeAspect="1"/>
@@ -11382,7 +11382,7 @@
                   <pic:spPr>
                     <a:xfrm>
                       <a:off x="0" y="0"/>
-                      <a:ext cx="5943600" cy="3286379"/>
+                      <a:ext cx="5943600" cy="3389117"/>
                     </a:xfrm>
                     <a:prstGeom prst="rect"/>
                   </pic:spPr>

</xml_diff>